<commit_message>
Added the some notes on microservices
</commit_message>
<xml_diff>
--- a/microservices/Microservice_Question.docx
+++ b/microservices/Microservice_Question.docx
@@ -59,7 +59,7 @@
           <w:r>
             <w:fldChar w:fldCharType="separate"/>
           </w:r>
-          <w:hyperlink w:anchor="_Toc177849446" w:history="1">
+          <w:hyperlink w:anchor="_Toc187395989" w:history="1">
             <w:r>
               <w:rPr>
                 <w:rStyle w:val="Hyperlink"/>
@@ -103,7 +103,7 @@
                 <w:noProof/>
                 <w:webHidden/>
               </w:rPr>
-              <w:instrText xml:space="preserve"> PAGEREF _Toc177849446 \h </w:instrText>
+              <w:instrText xml:space="preserve"> PAGEREF _Toc187395989 \h </w:instrText>
             </w:r>
             <w:r>
               <w:rPr>
@@ -148,13 +148,13 @@
               <w:lang w:eastAsia="en-IN"/>
             </w:rPr>
           </w:pPr>
-          <w:hyperlink w:anchor="_Toc177849447" w:history="1">
+          <w:hyperlink w:anchor="_Toc187395990" w:history="1">
             <w:r>
               <w:rPr>
                 <w:rStyle w:val="Hyperlink"/>
                 <w:noProof/>
               </w:rPr>
-              <w:t>Resources: https://www.geeksforgeeks.org/microservices-interview-questions/</w:t>
+              <w:t>Resources: Introduction - Blue/Green Deployments on AWS (amazon.com)</w:t>
             </w:r>
             <w:r>
               <w:rPr>
@@ -175,7 +175,7 @@
                 <w:noProof/>
                 <w:webHidden/>
               </w:rPr>
-              <w:instrText xml:space="preserve"> PAGEREF _Toc177849447 \h </w:instrText>
+              <w:instrText xml:space="preserve"> PAGEREF _Toc187395990 \h </w:instrText>
             </w:r>
             <w:r>
               <w:rPr>
@@ -221,7 +221,7 @@
               <w:lang w:eastAsia="en-IN"/>
             </w:rPr>
           </w:pPr>
-          <w:hyperlink w:anchor="_Toc177849448" w:history="1">
+          <w:hyperlink w:anchor="_Toc187395991" w:history="1">
             <w:r>
               <w:rPr>
                 <w:rStyle w:val="Hyperlink"/>
@@ -265,7 +265,7 @@
                 <w:noProof/>
                 <w:webHidden/>
               </w:rPr>
-              <w:instrText xml:space="preserve"> PAGEREF _Toc177849448 \h </w:instrText>
+              <w:instrText xml:space="preserve"> PAGEREF _Toc187395991 \h </w:instrText>
             </w:r>
             <w:r>
               <w:rPr>
@@ -311,7 +311,7 @@
               <w:lang w:eastAsia="en-IN"/>
             </w:rPr>
           </w:pPr>
-          <w:hyperlink w:anchor="_Toc177849449" w:history="1">
+          <w:hyperlink w:anchor="_Toc187395992" w:history="1">
             <w:r>
               <w:rPr>
                 <w:rStyle w:val="Hyperlink"/>
@@ -355,7 +355,7 @@
                 <w:noProof/>
                 <w:webHidden/>
               </w:rPr>
-              <w:instrText xml:space="preserve"> PAGEREF _Toc177849449 \h </w:instrText>
+              <w:instrText xml:space="preserve"> PAGEREF _Toc187395992 \h </w:instrText>
             </w:r>
             <w:r>
               <w:rPr>
@@ -400,7 +400,7 @@
               <w:lang w:eastAsia="en-IN"/>
             </w:rPr>
           </w:pPr>
-          <w:hyperlink w:anchor="_Toc177849450" w:history="1">
+          <w:hyperlink w:anchor="_Toc187395993" w:history="1">
             <w:r>
               <w:rPr>
                 <w:rStyle w:val="Hyperlink"/>
@@ -427,7 +427,7 @@
                 <w:noProof/>
                 <w:webHidden/>
               </w:rPr>
-              <w:instrText xml:space="preserve"> PAGEREF _Toc177849450 \h </w:instrText>
+              <w:instrText xml:space="preserve"> PAGEREF _Toc187395993 \h </w:instrText>
             </w:r>
             <w:r>
               <w:rPr>
@@ -473,7 +473,7 @@
               <w:lang w:eastAsia="en-IN"/>
             </w:rPr>
           </w:pPr>
-          <w:hyperlink w:anchor="_Toc177849451" w:history="1">
+          <w:hyperlink w:anchor="_Toc187395994" w:history="1">
             <w:r>
               <w:rPr>
                 <w:rStyle w:val="Hyperlink"/>
@@ -517,7 +517,7 @@
                 <w:noProof/>
                 <w:webHidden/>
               </w:rPr>
-              <w:instrText xml:space="preserve"> PAGEREF _Toc177849451 \h </w:instrText>
+              <w:instrText xml:space="preserve"> PAGEREF _Toc187395994 \h </w:instrText>
             </w:r>
             <w:r>
               <w:rPr>
@@ -562,7 +562,7 @@
               <w:lang w:eastAsia="en-IN"/>
             </w:rPr>
           </w:pPr>
-          <w:hyperlink w:anchor="_Toc177849452" w:history="1">
+          <w:hyperlink w:anchor="_Toc187395995" w:history="1">
             <w:r>
               <w:rPr>
                 <w:rStyle w:val="Hyperlink"/>
@@ -589,7 +589,7 @@
                 <w:noProof/>
                 <w:webHidden/>
               </w:rPr>
-              <w:instrText xml:space="preserve"> PAGEREF _Toc177849452 \h </w:instrText>
+              <w:instrText xml:space="preserve"> PAGEREF _Toc187395995 \h </w:instrText>
             </w:r>
             <w:r>
               <w:rPr>
@@ -635,7 +635,7 @@
               <w:lang w:eastAsia="en-IN"/>
             </w:rPr>
           </w:pPr>
-          <w:hyperlink w:anchor="_Toc177849453" w:history="1">
+          <w:hyperlink w:anchor="_Toc187395996" w:history="1">
             <w:r>
               <w:rPr>
                 <w:rStyle w:val="Hyperlink"/>
@@ -679,7 +679,7 @@
                 <w:noProof/>
                 <w:webHidden/>
               </w:rPr>
-              <w:instrText xml:space="preserve"> PAGEREF _Toc177849453 \h </w:instrText>
+              <w:instrText xml:space="preserve"> PAGEREF _Toc187395996 \h </w:instrText>
             </w:r>
             <w:r>
               <w:rPr>
@@ -725,7 +725,7 @@
               <w:lang w:eastAsia="en-IN"/>
             </w:rPr>
           </w:pPr>
-          <w:hyperlink w:anchor="_Toc177849454" w:history="1">
+          <w:hyperlink w:anchor="_Toc187395997" w:history="1">
             <w:r>
               <w:rPr>
                 <w:rStyle w:val="Hyperlink"/>
@@ -769,7 +769,7 @@
                 <w:noProof/>
                 <w:webHidden/>
               </w:rPr>
-              <w:instrText xml:space="preserve"> PAGEREF _Toc177849454 \h </w:instrText>
+              <w:instrText xml:space="preserve"> PAGEREF _Toc187395997 \h </w:instrText>
             </w:r>
             <w:r>
               <w:rPr>
@@ -814,7 +814,7 @@
               <w:lang w:eastAsia="en-IN"/>
             </w:rPr>
           </w:pPr>
-          <w:hyperlink w:anchor="_Toc177849455" w:history="1">
+          <w:hyperlink w:anchor="_Toc187395998" w:history="1">
             <w:r>
               <w:rPr>
                 <w:rStyle w:val="Hyperlink"/>
@@ -841,7 +841,7 @@
                 <w:noProof/>
                 <w:webHidden/>
               </w:rPr>
-              <w:instrText xml:space="preserve"> PAGEREF _Toc177849455 \h </w:instrText>
+              <w:instrText xml:space="preserve"> PAGEREF _Toc187395998 \h </w:instrText>
             </w:r>
             <w:r>
               <w:rPr>
@@ -887,7 +887,7 @@
               <w:lang w:eastAsia="en-IN"/>
             </w:rPr>
           </w:pPr>
-          <w:hyperlink w:anchor="_Toc177849456" w:history="1">
+          <w:hyperlink w:anchor="_Toc187395999" w:history="1">
             <w:r>
               <w:rPr>
                 <w:rStyle w:val="Hyperlink"/>
@@ -931,7 +931,7 @@
                 <w:noProof/>
                 <w:webHidden/>
               </w:rPr>
-              <w:instrText xml:space="preserve"> PAGEREF _Toc177849456 \h </w:instrText>
+              <w:instrText xml:space="preserve"> PAGEREF _Toc187395999 \h </w:instrText>
             </w:r>
             <w:r>
               <w:rPr>
@@ -977,7 +977,7 @@
               <w:lang w:eastAsia="en-IN"/>
             </w:rPr>
           </w:pPr>
-          <w:hyperlink w:anchor="_Toc177849457" w:history="1">
+          <w:hyperlink w:anchor="_Toc187396000" w:history="1">
             <w:r>
               <w:rPr>
                 <w:rStyle w:val="Hyperlink"/>
@@ -1021,7 +1021,7 @@
                 <w:noProof/>
                 <w:webHidden/>
               </w:rPr>
-              <w:instrText xml:space="preserve"> PAGEREF _Toc177849457 \h </w:instrText>
+              <w:instrText xml:space="preserve"> PAGEREF _Toc187396000 \h </w:instrText>
             </w:r>
             <w:r>
               <w:rPr>
@@ -1067,7 +1067,7 @@
               <w:lang w:eastAsia="en-IN"/>
             </w:rPr>
           </w:pPr>
-          <w:hyperlink w:anchor="_Toc177849458" w:history="1">
+          <w:hyperlink w:anchor="_Toc187396001" w:history="1">
             <w:r>
               <w:rPr>
                 <w:rStyle w:val="Hyperlink"/>
@@ -1111,7 +1111,7 @@
                 <w:noProof/>
                 <w:webHidden/>
               </w:rPr>
-              <w:instrText xml:space="preserve"> PAGEREF _Toc177849458 \h </w:instrText>
+              <w:instrText xml:space="preserve"> PAGEREF _Toc187396001 \h </w:instrText>
             </w:r>
             <w:r>
               <w:rPr>
@@ -1156,7 +1156,7 @@
               <w:lang w:eastAsia="en-IN"/>
             </w:rPr>
           </w:pPr>
-          <w:hyperlink w:anchor="_Toc177849459" w:history="1">
+          <w:hyperlink w:anchor="_Toc187396002" w:history="1">
             <w:r>
               <w:rPr>
                 <w:rStyle w:val="Hyperlink"/>
@@ -1183,7 +1183,7 @@
                 <w:noProof/>
                 <w:webHidden/>
               </w:rPr>
-              <w:instrText xml:space="preserve"> PAGEREF _Toc177849459 \h </w:instrText>
+              <w:instrText xml:space="preserve"> PAGEREF _Toc187396002 \h </w:instrText>
             </w:r>
             <w:r>
               <w:rPr>
@@ -1229,7 +1229,7 @@
               <w:lang w:eastAsia="en-IN"/>
             </w:rPr>
           </w:pPr>
-          <w:hyperlink w:anchor="_Toc177849460" w:history="1">
+          <w:hyperlink w:anchor="_Toc187396003" w:history="1">
             <w:r>
               <w:rPr>
                 <w:rStyle w:val="Hyperlink"/>
@@ -1252,7 +1252,7 @@
                 <w:rStyle w:val="Hyperlink"/>
                 <w:noProof/>
               </w:rPr>
-              <w:t>What is circuit Breaker in microservice?</w:t>
+              <w:t>What is Circuit Breaker in microservice?</w:t>
             </w:r>
             <w:r>
               <w:rPr>
@@ -1273,7 +1273,7 @@
                 <w:noProof/>
                 <w:webHidden/>
               </w:rPr>
-              <w:instrText xml:space="preserve"> PAGEREF _Toc177849460 \h </w:instrText>
+              <w:instrText xml:space="preserve"> PAGEREF _Toc187396003 \h </w:instrText>
             </w:r>
             <w:r>
               <w:rPr>
@@ -1318,7 +1318,7 @@
               <w:lang w:eastAsia="en-IN"/>
             </w:rPr>
           </w:pPr>
-          <w:hyperlink w:anchor="_Toc177849461" w:history="1">
+          <w:hyperlink w:anchor="_Toc187396004" w:history="1">
             <w:r>
               <w:rPr>
                 <w:rStyle w:val="Hyperlink"/>
@@ -1345,7 +1345,7 @@
                 <w:noProof/>
                 <w:webHidden/>
               </w:rPr>
-              <w:instrText xml:space="preserve"> PAGEREF _Toc177849461 \h </w:instrText>
+              <w:instrText xml:space="preserve"> PAGEREF _Toc187396004 \h </w:instrText>
             </w:r>
             <w:r>
               <w:rPr>
@@ -1365,7 +1365,7 @@
                 <w:noProof/>
                 <w:webHidden/>
               </w:rPr>
-              <w:t>5</w:t>
+              <w:t>6</w:t>
             </w:r>
             <w:r>
               <w:rPr>
@@ -1391,7 +1391,7 @@
               <w:lang w:eastAsia="en-IN"/>
             </w:rPr>
           </w:pPr>
-          <w:hyperlink w:anchor="_Toc177849462" w:history="1">
+          <w:hyperlink w:anchor="_Toc187396005" w:history="1">
             <w:r>
               <w:rPr>
                 <w:rStyle w:val="Hyperlink"/>
@@ -1414,7 +1414,7 @@
                 <w:rStyle w:val="Hyperlink"/>
                 <w:noProof/>
               </w:rPr>
-              <w:t>Tell me about some design in microservice?</w:t>
+              <w:t>Tell me about some design pattern in microservice?</w:t>
             </w:r>
             <w:r>
               <w:rPr>
@@ -1435,7 +1435,7 @@
                 <w:noProof/>
                 <w:webHidden/>
               </w:rPr>
-              <w:instrText xml:space="preserve"> PAGEREF _Toc177849462 \h </w:instrText>
+              <w:instrText xml:space="preserve"> PAGEREF _Toc187396005 \h </w:instrText>
             </w:r>
             <w:r>
               <w:rPr>
@@ -1481,7 +1481,7 @@
               <w:lang w:eastAsia="en-IN"/>
             </w:rPr>
           </w:pPr>
-          <w:hyperlink w:anchor="_Toc177849463" w:history="1">
+          <w:hyperlink w:anchor="_Toc187396006" w:history="1">
             <w:r>
               <w:rPr>
                 <w:rStyle w:val="Hyperlink"/>
@@ -1525,7 +1525,7 @@
                 <w:noProof/>
                 <w:webHidden/>
               </w:rPr>
-              <w:instrText xml:space="preserve"> PAGEREF _Toc177849463 \h </w:instrText>
+              <w:instrText xml:space="preserve"> PAGEREF _Toc187396006 \h </w:instrText>
             </w:r>
             <w:r>
               <w:rPr>
@@ -1545,7 +1545,7 @@
                 <w:noProof/>
                 <w:webHidden/>
               </w:rPr>
-              <w:t>6</w:t>
+              <w:t>7</w:t>
             </w:r>
             <w:r>
               <w:rPr>
@@ -1570,7 +1570,7 @@
               <w:lang w:eastAsia="en-IN"/>
             </w:rPr>
           </w:pPr>
-          <w:hyperlink w:anchor="_Toc177849464" w:history="1">
+          <w:hyperlink w:anchor="_Toc187396007" w:history="1">
             <w:r>
               <w:rPr>
                 <w:rStyle w:val="Hyperlink"/>
@@ -1597,7 +1597,7 @@
                 <w:noProof/>
                 <w:webHidden/>
               </w:rPr>
-              <w:instrText xml:space="preserve"> PAGEREF _Toc177849464 \h </w:instrText>
+              <w:instrText xml:space="preserve"> PAGEREF _Toc187396007 \h </w:instrText>
             </w:r>
             <w:r>
               <w:rPr>
@@ -1617,7 +1617,7 @@
                 <w:noProof/>
                 <w:webHidden/>
               </w:rPr>
-              <w:t>6</w:t>
+              <w:t>7</w:t>
             </w:r>
             <w:r>
               <w:rPr>
@@ -1643,7 +1643,7 @@
               <w:lang w:eastAsia="en-IN"/>
             </w:rPr>
           </w:pPr>
-          <w:hyperlink w:anchor="_Toc177849465" w:history="1">
+          <w:hyperlink w:anchor="_Toc187396008" w:history="1">
             <w:r>
               <w:rPr>
                 <w:rStyle w:val="Hyperlink"/>
@@ -1687,7 +1687,7 @@
                 <w:noProof/>
                 <w:webHidden/>
               </w:rPr>
-              <w:instrText xml:space="preserve"> PAGEREF _Toc177849465 \h </w:instrText>
+              <w:instrText xml:space="preserve"> PAGEREF _Toc187396008 \h </w:instrText>
             </w:r>
             <w:r>
               <w:rPr>
@@ -1707,7 +1707,7 @@
                 <w:noProof/>
                 <w:webHidden/>
               </w:rPr>
-              <w:t>6</w:t>
+              <w:t>7</w:t>
             </w:r>
             <w:r>
               <w:rPr>
@@ -1732,7 +1732,7 @@
               <w:lang w:eastAsia="en-IN"/>
             </w:rPr>
           </w:pPr>
-          <w:hyperlink w:anchor="_Toc177849466" w:history="1">
+          <w:hyperlink w:anchor="_Toc187396009" w:history="1">
             <w:r>
               <w:rPr>
                 <w:rStyle w:val="Hyperlink"/>
@@ -1759,7 +1759,7 @@
                 <w:noProof/>
                 <w:webHidden/>
               </w:rPr>
-              <w:instrText xml:space="preserve"> PAGEREF _Toc177849466 \h </w:instrText>
+              <w:instrText xml:space="preserve"> PAGEREF _Toc187396009 \h </w:instrText>
             </w:r>
             <w:r>
               <w:rPr>
@@ -1779,7 +1779,7 @@
                 <w:noProof/>
                 <w:webHidden/>
               </w:rPr>
-              <w:t>7</w:t>
+              <w:t>8</w:t>
             </w:r>
             <w:r>
               <w:rPr>
@@ -1805,7 +1805,7 @@
               <w:lang w:eastAsia="en-IN"/>
             </w:rPr>
           </w:pPr>
-          <w:hyperlink w:anchor="_Toc177849467" w:history="1">
+          <w:hyperlink w:anchor="_Toc187396010" w:history="1">
             <w:r>
               <w:rPr>
                 <w:rStyle w:val="Hyperlink"/>
@@ -1849,7 +1849,7 @@
                 <w:noProof/>
                 <w:webHidden/>
               </w:rPr>
-              <w:instrText xml:space="preserve"> PAGEREF _Toc177849467 \h </w:instrText>
+              <w:instrText xml:space="preserve"> PAGEREF _Toc187396010 \h </w:instrText>
             </w:r>
             <w:r>
               <w:rPr>
@@ -1869,7 +1869,7 @@
                 <w:noProof/>
                 <w:webHidden/>
               </w:rPr>
-              <w:t>7</w:t>
+              <w:t>8</w:t>
             </w:r>
             <w:r>
               <w:rPr>
@@ -1894,7 +1894,7 @@
               <w:lang w:eastAsia="en-IN"/>
             </w:rPr>
           </w:pPr>
-          <w:hyperlink w:anchor="_Toc177849468" w:history="1">
+          <w:hyperlink w:anchor="_Toc187396011" w:history="1">
             <w:r>
               <w:rPr>
                 <w:rStyle w:val="Hyperlink"/>
@@ -1921,7 +1921,7 @@
                 <w:noProof/>
                 <w:webHidden/>
               </w:rPr>
-              <w:instrText xml:space="preserve"> PAGEREF _Toc177849468 \h </w:instrText>
+              <w:instrText xml:space="preserve"> PAGEREF _Toc187396011 \h </w:instrText>
             </w:r>
             <w:r>
               <w:rPr>
@@ -1941,7 +1941,97 @@
                 <w:noProof/>
                 <w:webHidden/>
               </w:rPr>
-              <w:t>7</w:t>
+              <w:t>8</w:t>
+            </w:r>
+            <w:r>
+              <w:rPr>
+                <w:noProof/>
+                <w:webHidden/>
+              </w:rPr>
+              <w:fldChar w:fldCharType="end"/>
+            </w:r>
+          </w:hyperlink>
+        </w:p>
+        <w:p>
+          <w:pPr>
+            <w:pStyle w:val="TOC2"/>
+            <w:tabs>
+              <w:tab w:val="left" w:pos="960"/>
+              <w:tab w:val="right" w:leader="dot" w:pos="10456"/>
+            </w:tabs>
+            <w:rPr>
+              <w:rFonts w:eastAsiaTheme="minorEastAsia"/>
+              <w:noProof/>
+              <w:sz w:val="24"/>
+              <w:szCs w:val="24"/>
+              <w:lang w:eastAsia="en-IN"/>
+            </w:rPr>
+          </w:pPr>
+          <w:hyperlink w:anchor="_Toc187396012" w:history="1">
+            <w:r>
+              <w:rPr>
+                <w:rStyle w:val="Hyperlink"/>
+                <w:noProof/>
+              </w:rPr>
+              <w:t>15.</w:t>
+            </w:r>
+            <w:r>
+              <w:rPr>
+                <w:rFonts w:eastAsiaTheme="minorEastAsia"/>
+                <w:noProof/>
+                <w:sz w:val="24"/>
+                <w:szCs w:val="24"/>
+                <w:lang w:eastAsia="en-IN"/>
+              </w:rPr>
+              <w:tab/>
+            </w:r>
+            <w:r>
+              <w:rPr>
+                <w:rStyle w:val="Hyperlink"/>
+                <w:noProof/>
+              </w:rPr>
+              <w:t>Why spring deprecated the rest client? or it’s disadvantaged?</w:t>
+            </w:r>
+            <w:r>
+              <w:rPr>
+                <w:noProof/>
+                <w:webHidden/>
+              </w:rPr>
+              <w:tab/>
+            </w:r>
+            <w:r>
+              <w:rPr>
+                <w:noProof/>
+                <w:webHidden/>
+              </w:rPr>
+              <w:fldChar w:fldCharType="begin"/>
+            </w:r>
+            <w:r>
+              <w:rPr>
+                <w:noProof/>
+                <w:webHidden/>
+              </w:rPr>
+              <w:instrText xml:space="preserve"> PAGEREF _Toc187396012 \h </w:instrText>
+            </w:r>
+            <w:r>
+              <w:rPr>
+                <w:noProof/>
+                <w:webHidden/>
+              </w:rPr>
+            </w:r>
+            <w:r>
+              <w:rPr>
+                <w:noProof/>
+                <w:webHidden/>
+              </w:rPr>
+              <w:fldChar w:fldCharType="separate"/>
+            </w:r>
+            <w:r>
+              <w:rPr>
+                <w:noProof/>
+                <w:webHidden/>
+              </w:rPr>
+              <w:t>8</w:t>
             </w:r>
             <w:r>
               <w:rPr>
@@ -1975,7 +2065,7 @@
           <w:numId w:val="2"/>
         </w:numPr>
       </w:pPr>
-      <w:bookmarkStart w:id="0" w:name="_Toc177849446"/>
+      <w:bookmarkStart w:id="0" w:name="_Toc187395989"/>
       <w:r>
         <w:lastRenderedPageBreak/>
         <w:t>What is microservice and why we used it?</w:t>
@@ -2261,29 +2351,19 @@
       <w:r>
         <w:tab/>
       </w:r>
-      <w:bookmarkStart w:id="1" w:name="_Toc177849447"/>
+      <w:bookmarkStart w:id="1" w:name="_Toc187395990"/>
       <w:r>
         <w:t xml:space="preserve">Resources: </w:t>
       </w:r>
-      <w:bookmarkEnd w:id="1"/>
-      <w:r>
-        <w:fldChar w:fldCharType="begin"/>
-      </w:r>
-      <w:r>
-        <w:instrText>HYPERLINK "https://docs.aws.amazon.com/whitepapers/latest/blue-green-deployments/introduction.html"</w:instrText>
-      </w:r>
-      <w:r>
-        <w:fldChar w:fldCharType="separate"/>
-      </w:r>
-      <w:r>
-        <w:rPr>
-          <w:rStyle w:val="Hyperlink"/>
-        </w:rPr>
-        <w:t>Introduction - Blue/Green Deployments on AWS (amazon.com)</w:t>
-      </w:r>
-      <w:r>
-        <w:fldChar w:fldCharType="end"/>
-      </w:r>
+      <w:hyperlink r:id="rId7" w:history="1">
+        <w:r>
+          <w:rPr>
+            <w:rStyle w:val="Hyperlink"/>
+          </w:rPr>
+          <w:t>Introduction - Blue/Green Deployments on AWS (amazon.com)</w:t>
+        </w:r>
+        <w:bookmarkEnd w:id="1"/>
+      </w:hyperlink>
     </w:p>
     <w:p>
       <w:pPr>
@@ -2317,7 +2397,7 @@
           <w:numId w:val="2"/>
         </w:numPr>
       </w:pPr>
-      <w:bookmarkStart w:id="2" w:name="_Toc177849448"/>
+      <w:bookmarkStart w:id="2" w:name="_Toc187395991"/>
       <w:r>
         <w:lastRenderedPageBreak/>
         <w:t>Diff between the Monolithic, SOA, and Microservices</w:t>
@@ -2666,7 +2746,7 @@
           <w:numId w:val="2"/>
         </w:numPr>
       </w:pPr>
-      <w:bookmarkStart w:id="3" w:name="_Toc177849449"/>
+      <w:bookmarkStart w:id="3" w:name="_Toc187395992"/>
       <w:r>
         <w:t>What is Eureka Service/ Service Registry?</w:t>
       </w:r>
@@ -2895,7 +2975,7 @@
         <w:pStyle w:val="Heading4"/>
         <w:ind w:firstLine="360"/>
       </w:pPr>
-      <w:bookmarkStart w:id="4" w:name="_Toc177849450"/>
+      <w:bookmarkStart w:id="4" w:name="_Toc187395993"/>
       <w:r>
         <w:t>Resources:</w:t>
       </w:r>
@@ -2916,7 +2996,7 @@
           <w:numId w:val="2"/>
         </w:numPr>
       </w:pPr>
-      <w:bookmarkStart w:id="5" w:name="_Toc177849451"/>
+      <w:bookmarkStart w:id="5" w:name="_Toc187395994"/>
       <w:r>
         <w:t>What is blue green deployment?</w:t>
       </w:r>
@@ -2939,7 +3019,7 @@
       <w:pPr>
         <w:pStyle w:val="Heading4"/>
       </w:pPr>
-      <w:bookmarkStart w:id="6" w:name="_Toc177849452"/>
+      <w:bookmarkStart w:id="6" w:name="_Toc187395995"/>
       <w:r>
         <w:t>Resource: https://docs.aws.amazon.com/whitepapers/latest/overview-deployment-options/bluegreen-deployments.html</w:t>
       </w:r>
@@ -2954,7 +3034,7 @@
           <w:numId w:val="2"/>
         </w:numPr>
       </w:pPr>
-      <w:bookmarkStart w:id="7" w:name="_Toc177849453"/>
+      <w:bookmarkStart w:id="7" w:name="_Toc187395996"/>
       <w:r>
         <w:t xml:space="preserve">What is </w:t>
       </w:r>
@@ -3002,7 +3082,7 @@
                     </pic:cNvPicPr>
                   </pic:nvPicPr>
                   <pic:blipFill>
-                    <a:blip r:embed="rId7">
+                    <a:blip r:embed="rId8">
                       <a:extLst>
                         <a:ext uri="{28A0092B-C50C-407E-A947-70E740481C1C}">
                           <a14:useLocalDpi xmlns:a14="http://schemas.microsoft.com/office/drawing/2010/main" val="0"/>
@@ -3043,7 +3123,7 @@
           <w:numId w:val="2"/>
         </w:numPr>
       </w:pPr>
-      <w:bookmarkStart w:id="8" w:name="_Toc177849454"/>
+      <w:bookmarkStart w:id="8" w:name="_Toc187395997"/>
       <w:r>
         <w:t>What is Saga pattern in microservices?</w:t>
       </w:r>
@@ -3068,7 +3148,7 @@
       </w:r>
     </w:p>
     <w:p>
-      <w:bookmarkStart w:id="9" w:name="_Toc177849455"/>
+      <w:bookmarkStart w:id="9" w:name="_Toc187395998"/>
       <w:r>
         <w:rPr>
           <w:rStyle w:val="Heading4Char"/>
@@ -3079,7 +3159,7 @@
       <w:r>
         <w:t xml:space="preserve"> </w:t>
       </w:r>
-      <w:hyperlink r:id="rId8" w:anchor="1-what-is-saga-architecture-pattern" w:history="1">
+      <w:hyperlink r:id="rId9" w:anchor="1-what-is-saga-architecture-pattern" w:history="1">
         <w:r>
           <w:rPr>
             <w:rStyle w:val="Hyperlink"/>
@@ -3096,7 +3176,7 @@
           <w:numId w:val="2"/>
         </w:numPr>
       </w:pPr>
-      <w:bookmarkStart w:id="10" w:name="_Toc177849456"/>
+      <w:bookmarkStart w:id="10" w:name="_Toc187395999"/>
       <w:r>
         <w:lastRenderedPageBreak/>
         <w:t>What is resiliency in microservice?</w:t>
@@ -3120,7 +3200,7 @@
           <w:numId w:val="2"/>
         </w:numPr>
       </w:pPr>
-      <w:bookmarkStart w:id="11" w:name="_Toc177849457"/>
+      <w:bookmarkStart w:id="11" w:name="_Toc187396000"/>
       <w:r>
         <w:t>What is fault tolerance then?</w:t>
       </w:r>
@@ -3179,28 +3259,21 @@
           <w:numId w:val="2"/>
         </w:numPr>
       </w:pPr>
-      <w:bookmarkStart w:id="12" w:name="_Toc177849458"/>
+      <w:bookmarkStart w:id="12" w:name="_Toc187396001"/>
       <w:r>
         <w:t xml:space="preserve">What is </w:t>
       </w:r>
-      <w:proofErr w:type="spellStart"/>
       <w:r>
         <w:t>Hystrix</w:t>
       </w:r>
-      <w:proofErr w:type="spellEnd"/>
       <w:r>
         <w:t xml:space="preserve"> in microservice?</w:t>
       </w:r>
       <w:bookmarkEnd w:id="12"/>
     </w:p>
     <w:p>
-      <w:proofErr w:type="spellStart"/>
-      <w:r>
-        <w:t>Hystrix</w:t>
-      </w:r>
-      <w:proofErr w:type="spellEnd"/>
-      <w:r>
-        <w:t xml:space="preserve"> is one of the components, and it can be used to stop cascading failures and enable resilience in complex distributed systems. It is a latency and fault tolerance library designed to isolate points of access to remote systems.</w:t>
+      <w:r>
+        <w:t>Hystrix is one of the components, and it can be used to stop cascading failures and enable resilience in complex distributed systems. It is a latency and fault tolerance library designed to isolate points of access to remote systems.</w:t>
       </w:r>
     </w:p>
     <w:p>
@@ -3227,15 +3300,7 @@
         <w:t>Circuit Breaker</w:t>
       </w:r>
       <w:r>
-        <w:t xml:space="preserve">: In Spring Cloud Netflix, </w:t>
-      </w:r>
-      <w:proofErr w:type="spellStart"/>
-      <w:r>
-        <w:t>Hystrix</w:t>
-      </w:r>
-      <w:proofErr w:type="spellEnd"/>
-      <w:r>
-        <w:t xml:space="preserve"> can use the circuit breaker pattern to stop cascading failures in the microservices environment. When failures occur, the circuit breaker calling the failing services is automatically redirected to the fallback mechanism.</w:t>
+        <w:t>: In Spring Cloud Netflix, Hystrix can use the circuit breaker pattern to stop cascading failures in the microservices environment. When failures occur, the circuit breaker calling the failing services is automatically redirected to the fallback mechanism.</w:t>
       </w:r>
     </w:p>
     <w:p>
@@ -3271,15 +3336,7 @@
         <w:t>Command</w:t>
       </w:r>
       <w:r>
-        <w:t xml:space="preserve">: </w:t>
-      </w:r>
-      <w:proofErr w:type="spellStart"/>
-      <w:r>
-        <w:t>Hystrix</w:t>
-      </w:r>
-      <w:proofErr w:type="spellEnd"/>
-      <w:r>
-        <w:t xml:space="preserve"> command can be used to represent a potential failure point in the system or microservice.</w:t>
+        <w:t>: Hystrix command can be used to represent a potential failure point in the system or microservice.</w:t>
       </w:r>
     </w:p>
     <w:p>
@@ -3304,7 +3361,7 @@
       <w:pPr>
         <w:ind w:firstLine="360"/>
       </w:pPr>
-      <w:bookmarkStart w:id="13" w:name="_Toc177849459"/>
+      <w:bookmarkStart w:id="13" w:name="_Toc187396002"/>
       <w:r>
         <w:rPr>
           <w:rStyle w:val="Heading4Char"/>
@@ -3315,7 +3372,7 @@
       <w:r>
         <w:t xml:space="preserve"> </w:t>
       </w:r>
-      <w:hyperlink r:id="rId9" w:history="1">
+      <w:hyperlink r:id="rId10" w:history="1">
         <w:r>
           <w:rPr>
             <w:rStyle w:val="Hyperlink"/>
@@ -3337,7 +3394,7 @@
           <w:numId w:val="2"/>
         </w:numPr>
       </w:pPr>
-      <w:bookmarkStart w:id="14" w:name="_Toc177849460"/>
+      <w:bookmarkStart w:id="14" w:name="_Toc187396003"/>
       <w:r>
         <w:t xml:space="preserve">What is </w:t>
       </w:r>
@@ -3388,7 +3445,7 @@
                     </pic:cNvPicPr>
                   </pic:nvPicPr>
                   <pic:blipFill>
-                    <a:blip r:embed="rId10">
+                    <a:blip r:embed="rId11">
                       <a:extLst>
                         <a:ext uri="{28A0092B-C50C-407E-A947-70E740481C1C}">
                           <a14:useLocalDpi xmlns:a14="http://schemas.microsoft.com/office/drawing/2010/main" val="0"/>
@@ -3494,7 +3551,7 @@
     </w:p>
     <w:p/>
     <w:p>
-      <w:bookmarkStart w:id="15" w:name="_Toc177849461"/>
+      <w:bookmarkStart w:id="15" w:name="_Toc187396004"/>
       <w:r>
         <w:rPr>
           <w:rStyle w:val="Heading4Char"/>
@@ -3521,7 +3578,7 @@
           <w:numId w:val="2"/>
         </w:numPr>
       </w:pPr>
-      <w:bookmarkStart w:id="16" w:name="_Toc177849462"/>
+      <w:bookmarkStart w:id="16" w:name="_Toc187396005"/>
       <w:r>
         <w:t xml:space="preserve">Tell </w:t>
       </w:r>
@@ -3782,7 +3839,7 @@
           <w:numId w:val="2"/>
         </w:numPr>
       </w:pPr>
-      <w:bookmarkStart w:id="17" w:name="_Toc177849463"/>
+      <w:bookmarkStart w:id="17" w:name="_Toc187396006"/>
       <w:r>
         <w:t>How to microservices communicate with each other in spring boot?</w:t>
       </w:r>
@@ -3901,11 +3958,11 @@
         <w:pStyle w:val="Heading4"/>
         <w:ind w:left="720"/>
       </w:pPr>
-      <w:bookmarkStart w:id="18" w:name="_Toc177849464"/>
+      <w:bookmarkStart w:id="18" w:name="_Toc187396007"/>
       <w:r>
         <w:t xml:space="preserve">Resources: </w:t>
       </w:r>
-      <w:hyperlink r:id="rId11" w:history="1">
+      <w:hyperlink r:id="rId12" w:history="1">
         <w:r>
           <w:rPr>
             <w:rStyle w:val="Hyperlink"/>
@@ -3924,7 +3981,7 @@
           <w:numId w:val="2"/>
         </w:numPr>
       </w:pPr>
-      <w:bookmarkStart w:id="19" w:name="_Toc177849465"/>
+      <w:bookmarkStart w:id="19" w:name="_Toc187396008"/>
       <w:r>
         <w:t>Diff between the synchronous and asynchronous</w:t>
       </w:r>
@@ -3996,7 +4053,7 @@
             <w:r>
               <w:t>In </w:t>
             </w:r>
-            <w:hyperlink r:id="rId12" w:history="1">
+            <w:hyperlink r:id="rId13" w:history="1">
               <w:r>
                 <w:rPr>
                   <w:rStyle w:val="Hyperlink"/>
@@ -4022,7 +4079,7 @@
             <w:r>
               <w:t>In </w:t>
             </w:r>
-            <w:hyperlink r:id="rId13" w:history="1">
+            <w:hyperlink r:id="rId14" w:history="1">
               <w:r>
                 <w:rPr>
                   <w:rStyle w:val="Hyperlink"/>
@@ -4437,11 +4494,11 @@
         <w:pStyle w:val="Heading4"/>
         <w:ind w:left="720"/>
       </w:pPr>
-      <w:bookmarkStart w:id="20" w:name="_Toc177849466"/>
+      <w:bookmarkStart w:id="20" w:name="_Toc187396009"/>
       <w:r>
         <w:t xml:space="preserve">Resources: </w:t>
       </w:r>
-      <w:hyperlink r:id="rId14" w:history="1">
+      <w:hyperlink r:id="rId15" w:history="1">
         <w:r>
           <w:rPr>
             <w:rStyle w:val="Hyperlink"/>
@@ -4463,7 +4520,7 @@
           <w:numId w:val="2"/>
         </w:numPr>
       </w:pPr>
-      <w:bookmarkStart w:id="21" w:name="_Toc177849467"/>
+      <w:bookmarkStart w:id="21" w:name="_Toc187396010"/>
       <w:r>
         <w:t>What is spring cloud and how it’s useful?</w:t>
       </w:r>
@@ -4586,15 +4643,197 @@
         <w:pStyle w:val="Heading4"/>
         <w:ind w:firstLine="720"/>
       </w:pPr>
-      <w:bookmarkStart w:id="22" w:name="_Toc177849468"/>
+      <w:bookmarkStart w:id="22" w:name="_Toc187396011"/>
       <w:r>
         <w:t xml:space="preserve">Resources: </w:t>
       </w:r>
-      <w:r>
-        <w:t>https://www.geeksforgeeks.org/what-is-spring-cloud/</w:t>
-      </w:r>
-      <w:bookmarkEnd w:id="22"/>
-    </w:p>
+      <w:hyperlink r:id="rId16" w:history="1">
+        <w:r>
+          <w:rPr>
+            <w:rStyle w:val="Hyperlink"/>
+          </w:rPr>
+          <w:t>https://www.geeksforgeeks.org/what-is-spring-cloud/</w:t>
+        </w:r>
+        <w:bookmarkEnd w:id="22"/>
+      </w:hyperlink>
+    </w:p>
+    <w:p/>
+    <w:p>
+      <w:pPr>
+        <w:pStyle w:val="Heading2"/>
+        <w:numPr>
+          <w:ilvl w:val="0"/>
+          <w:numId w:val="2"/>
+        </w:numPr>
+      </w:pPr>
+      <w:bookmarkStart w:id="23" w:name="_Toc187396012"/>
+      <w:r>
+        <w:t xml:space="preserve">Why spring deprecated the rest </w:t>
+      </w:r>
+      <w:r>
+        <w:t>template</w:t>
+      </w:r>
+      <w:r>
+        <w:t xml:space="preserve">? or it’s </w:t>
+      </w:r>
+      <w:r>
+        <w:t>disadvantaged</w:t>
+      </w:r>
+      <w:r>
+        <w:t>?</w:t>
+      </w:r>
+      <w:bookmarkEnd w:id="23"/>
+      <w:r>
+        <w:t xml:space="preserve"> </w:t>
+      </w:r>
+    </w:p>
+    <w:p>
+      <w:pPr>
+        <w:ind w:left="360"/>
+      </w:pPr>
+      <w:r>
+        <w:t>Spring deprecated the "</w:t>
+      </w:r>
+      <w:proofErr w:type="spellStart"/>
+      <w:r>
+        <w:t>RestTemplate</w:t>
+      </w:r>
+      <w:proofErr w:type="spellEnd"/>
+      <w:r>
+        <w:t>" because it is a blocking, synchronous client, meaning it can't handle high-throughput scenarios efficiently, lacks support for reactive programming, and is considered outdated compared to the newer "</w:t>
+      </w:r>
+      <w:proofErr w:type="spellStart"/>
+      <w:r>
+        <w:t>WebClient</w:t>
+      </w:r>
+      <w:proofErr w:type="spellEnd"/>
+      <w:r>
+        <w:t>" which offers a non-blocking, reactive approach, providing better scalability and performance in modern applications. </w:t>
+      </w:r>
+    </w:p>
+    <w:p>
+      <w:pPr>
+        <w:ind w:left="360"/>
+      </w:pPr>
+      <w:r>
+        <w:t xml:space="preserve">Key disadvantages of </w:t>
+      </w:r>
+      <w:proofErr w:type="spellStart"/>
+      <w:r>
+        <w:t>RestTemplate</w:t>
+      </w:r>
+      <w:proofErr w:type="spellEnd"/>
+      <w:r>
+        <w:t>:</w:t>
+      </w:r>
+    </w:p>
+    <w:p>
+      <w:pPr>
+        <w:numPr>
+          <w:ilvl w:val="0"/>
+          <w:numId w:val="31"/>
+        </w:numPr>
+        <w:tabs>
+          <w:tab w:val="clear" w:pos="720"/>
+          <w:tab w:val="num" w:pos="1080"/>
+        </w:tabs>
+        <w:ind w:left="1080"/>
+      </w:pPr>
+      <w:r>
+        <w:rPr>
+          <w:b/>
+          <w:bCs/>
+        </w:rPr>
+        <w:t>Blocking nature:</w:t>
+      </w:r>
+    </w:p>
+    <w:p>
+      <w:pPr>
+        <w:ind w:left="1080"/>
+      </w:pPr>
+      <w:r>
+        <w:t>A single thread is blocked while waiting for a response from the server, which can lead to performance issues in high-traffic scenarios. </w:t>
+      </w:r>
+    </w:p>
+    <w:p>
+      <w:pPr>
+        <w:numPr>
+          <w:ilvl w:val="0"/>
+          <w:numId w:val="31"/>
+        </w:numPr>
+        <w:tabs>
+          <w:tab w:val="clear" w:pos="720"/>
+          <w:tab w:val="num" w:pos="1080"/>
+        </w:tabs>
+        <w:ind w:left="1080"/>
+      </w:pPr>
+      <w:r>
+        <w:rPr>
+          <w:b/>
+          <w:bCs/>
+        </w:rPr>
+        <w:t>Limited scalability:</w:t>
+      </w:r>
+    </w:p>
+    <w:p>
+      <w:pPr>
+        <w:ind w:left="1080"/>
+      </w:pPr>
+      <w:r>
+        <w:t xml:space="preserve">Due to its blocking </w:t>
+      </w:r>
+      <w:proofErr w:type="spellStart"/>
+      <w:r>
+        <w:t>behavior</w:t>
+      </w:r>
+      <w:proofErr w:type="spellEnd"/>
+      <w:r>
+        <w:t xml:space="preserve">, </w:t>
+      </w:r>
+      <w:proofErr w:type="spellStart"/>
+      <w:r>
+        <w:t>RestTemplate</w:t>
+      </w:r>
+      <w:proofErr w:type="spellEnd"/>
+      <w:r>
+        <w:t xml:space="preserve"> struggles to scale effectively in distributed systems. </w:t>
+      </w:r>
+    </w:p>
+    <w:p>
+      <w:pPr>
+        <w:numPr>
+          <w:ilvl w:val="0"/>
+          <w:numId w:val="31"/>
+        </w:numPr>
+        <w:tabs>
+          <w:tab w:val="clear" w:pos="720"/>
+          <w:tab w:val="num" w:pos="1080"/>
+        </w:tabs>
+        <w:ind w:left="1080"/>
+      </w:pPr>
+      <w:r>
+        <w:rPr>
+          <w:b/>
+          <w:bCs/>
+        </w:rPr>
+        <w:lastRenderedPageBreak/>
+        <w:t>No reactive programming support:</w:t>
+      </w:r>
+    </w:p>
+    <w:p>
+      <w:pPr>
+        <w:ind w:left="1080"/>
+      </w:pPr>
+      <w:proofErr w:type="spellStart"/>
+      <w:r>
+        <w:t>RestTemplate</w:t>
+      </w:r>
+      <w:proofErr w:type="spellEnd"/>
+      <w:r>
+        <w:t xml:space="preserve"> doesn't integrate well with reactive programming paradigms, which are increasingly important for building responsive applications</w:t>
+      </w:r>
+    </w:p>
+    <w:p/>
     <w:p/>
     <w:p/>
     <w:p/>
@@ -5951,6 +6190,155 @@
     </w:lvl>
   </w:abstractNum>
   <w:abstractNum w:abstractNumId="10" w15:restartNumberingAfterBreak="0">
+    <w:nsid w:val="51877D1C"/>
+    <w:multiLevelType w:val="multilevel"/>
+    <w:tmpl w:val="F648D39A"/>
+    <w:lvl w:ilvl="0">
+      <w:start w:val="1"/>
+      <w:numFmt w:val="bullet"/>
+      <w:lvlText w:val=""/>
+      <w:lvlJc w:val="left"/>
+      <w:pPr>
+        <w:tabs>
+          <w:tab w:val="num" w:pos="720"/>
+        </w:tabs>
+        <w:ind w:left="720" w:hanging="360"/>
+      </w:pPr>
+      <w:rPr>
+        <w:rFonts w:ascii="Symbol" w:hAnsi="Symbol" w:hint="default"/>
+        <w:sz w:val="20"/>
+      </w:rPr>
+    </w:lvl>
+    <w:lvl w:ilvl="1" w:tentative="1">
+      <w:start w:val="1"/>
+      <w:numFmt w:val="bullet"/>
+      <w:lvlText w:val="o"/>
+      <w:lvlJc w:val="left"/>
+      <w:pPr>
+        <w:tabs>
+          <w:tab w:val="num" w:pos="1440"/>
+        </w:tabs>
+        <w:ind w:left="1440" w:hanging="360"/>
+      </w:pPr>
+      <w:rPr>
+        <w:rFonts w:ascii="Courier New" w:hAnsi="Courier New" w:hint="default"/>
+        <w:sz w:val="20"/>
+      </w:rPr>
+    </w:lvl>
+    <w:lvl w:ilvl="2" w:tentative="1">
+      <w:start w:val="1"/>
+      <w:numFmt w:val="bullet"/>
+      <w:lvlText w:val=""/>
+      <w:lvlJc w:val="left"/>
+      <w:pPr>
+        <w:tabs>
+          <w:tab w:val="num" w:pos="2160"/>
+        </w:tabs>
+        <w:ind w:left="2160" w:hanging="360"/>
+      </w:pPr>
+      <w:rPr>
+        <w:rFonts w:ascii="Wingdings" w:hAnsi="Wingdings" w:hint="default"/>
+        <w:sz w:val="20"/>
+      </w:rPr>
+    </w:lvl>
+    <w:lvl w:ilvl="3" w:tentative="1">
+      <w:start w:val="1"/>
+      <w:numFmt w:val="bullet"/>
+      <w:lvlText w:val=""/>
+      <w:lvlJc w:val="left"/>
+      <w:pPr>
+        <w:tabs>
+          <w:tab w:val="num" w:pos="2880"/>
+        </w:tabs>
+        <w:ind w:left="2880" w:hanging="360"/>
+      </w:pPr>
+      <w:rPr>
+        <w:rFonts w:ascii="Wingdings" w:hAnsi="Wingdings" w:hint="default"/>
+        <w:sz w:val="20"/>
+      </w:rPr>
+    </w:lvl>
+    <w:lvl w:ilvl="4" w:tentative="1">
+      <w:start w:val="1"/>
+      <w:numFmt w:val="bullet"/>
+      <w:lvlText w:val=""/>
+      <w:lvlJc w:val="left"/>
+      <w:pPr>
+        <w:tabs>
+          <w:tab w:val="num" w:pos="3600"/>
+        </w:tabs>
+        <w:ind w:left="3600" w:hanging="360"/>
+      </w:pPr>
+      <w:rPr>
+        <w:rFonts w:ascii="Wingdings" w:hAnsi="Wingdings" w:hint="default"/>
+        <w:sz w:val="20"/>
+      </w:rPr>
+    </w:lvl>
+    <w:lvl w:ilvl="5" w:tentative="1">
+      <w:start w:val="1"/>
+      <w:numFmt w:val="bullet"/>
+      <w:lvlText w:val=""/>
+      <w:lvlJc w:val="left"/>
+      <w:pPr>
+        <w:tabs>
+          <w:tab w:val="num" w:pos="4320"/>
+        </w:tabs>
+        <w:ind w:left="4320" w:hanging="360"/>
+      </w:pPr>
+      <w:rPr>
+        <w:rFonts w:ascii="Wingdings" w:hAnsi="Wingdings" w:hint="default"/>
+        <w:sz w:val="20"/>
+      </w:rPr>
+    </w:lvl>
+    <w:lvl w:ilvl="6" w:tentative="1">
+      <w:start w:val="1"/>
+      <w:numFmt w:val="bullet"/>
+      <w:lvlText w:val=""/>
+      <w:lvlJc w:val="left"/>
+      <w:pPr>
+        <w:tabs>
+          <w:tab w:val="num" w:pos="5040"/>
+        </w:tabs>
+        <w:ind w:left="5040" w:hanging="360"/>
+      </w:pPr>
+      <w:rPr>
+        <w:rFonts w:ascii="Wingdings" w:hAnsi="Wingdings" w:hint="default"/>
+        <w:sz w:val="20"/>
+      </w:rPr>
+    </w:lvl>
+    <w:lvl w:ilvl="7" w:tentative="1">
+      <w:start w:val="1"/>
+      <w:numFmt w:val="bullet"/>
+      <w:lvlText w:val=""/>
+      <w:lvlJc w:val="left"/>
+      <w:pPr>
+        <w:tabs>
+          <w:tab w:val="num" w:pos="5760"/>
+        </w:tabs>
+        <w:ind w:left="5760" w:hanging="360"/>
+      </w:pPr>
+      <w:rPr>
+        <w:rFonts w:ascii="Wingdings" w:hAnsi="Wingdings" w:hint="default"/>
+        <w:sz w:val="20"/>
+      </w:rPr>
+    </w:lvl>
+    <w:lvl w:ilvl="8" w:tentative="1">
+      <w:start w:val="1"/>
+      <w:numFmt w:val="bullet"/>
+      <w:lvlText w:val=""/>
+      <w:lvlJc w:val="left"/>
+      <w:pPr>
+        <w:tabs>
+          <w:tab w:val="num" w:pos="6480"/>
+        </w:tabs>
+        <w:ind w:left="6480" w:hanging="360"/>
+      </w:pPr>
+      <w:rPr>
+        <w:rFonts w:ascii="Wingdings" w:hAnsi="Wingdings" w:hint="default"/>
+        <w:sz w:val="20"/>
+      </w:rPr>
+    </w:lvl>
+  </w:abstractNum>
+  <w:abstractNum w:abstractNumId="11" w15:restartNumberingAfterBreak="0">
     <w:nsid w:val="54FF0580"/>
     <w:multiLevelType w:val="hybridMultilevel"/>
     <w:tmpl w:val="B99AF888"/>
@@ -6039,7 +6427,7 @@
       </w:pPr>
     </w:lvl>
   </w:abstractNum>
-  <w:abstractNum w:abstractNumId="11" w15:restartNumberingAfterBreak="0">
+  <w:abstractNum w:abstractNumId="12" w15:restartNumberingAfterBreak="0">
     <w:nsid w:val="59A44252"/>
     <w:multiLevelType w:val="multilevel"/>
     <w:tmpl w:val="168E97AA"/>
@@ -6188,7 +6576,7 @@
       </w:rPr>
     </w:lvl>
   </w:abstractNum>
-  <w:abstractNum w:abstractNumId="12" w15:restartNumberingAfterBreak="0">
+  <w:abstractNum w:abstractNumId="13" w15:restartNumberingAfterBreak="0">
     <w:nsid w:val="70FF3FF9"/>
     <w:multiLevelType w:val="hybridMultilevel"/>
     <w:tmpl w:val="A45A81E6"/>
@@ -6277,7 +6665,7 @@
       </w:pPr>
     </w:lvl>
   </w:abstractNum>
-  <w:abstractNum w:abstractNumId="13" w15:restartNumberingAfterBreak="0">
+  <w:abstractNum w:abstractNumId="14" w15:restartNumberingAfterBreak="0">
     <w:nsid w:val="736F2FC4"/>
     <w:multiLevelType w:val="hybridMultilevel"/>
     <w:tmpl w:val="40AEBB0E"/>
@@ -6390,7 +6778,7 @@
       </w:rPr>
     </w:lvl>
   </w:abstractNum>
-  <w:abstractNum w:abstractNumId="14" w15:restartNumberingAfterBreak="0">
+  <w:abstractNum w:abstractNumId="15" w15:restartNumberingAfterBreak="0">
     <w:nsid w:val="769051EB"/>
     <w:multiLevelType w:val="hybridMultilevel"/>
     <w:tmpl w:val="BA7E0DE0"/>
@@ -6503,7 +6891,7 @@
       </w:rPr>
     </w:lvl>
   </w:abstractNum>
-  <w:abstractNum w:abstractNumId="15" w15:restartNumberingAfterBreak="0">
+  <w:abstractNum w:abstractNumId="16" w15:restartNumberingAfterBreak="0">
     <w:nsid w:val="7B63512D"/>
     <w:multiLevelType w:val="hybridMultilevel"/>
     <w:tmpl w:val="DBCCBBB8"/>
@@ -6590,7 +6978,7 @@
     </w:lvl>
   </w:abstractNum>
   <w:num w:numId="1" w16cid:durableId="1055278224">
-    <w:abstractNumId w:val="15"/>
+    <w:abstractNumId w:val="16"/>
   </w:num>
   <w:num w:numId="2" w16cid:durableId="421990468">
     <w:abstractNumId w:val="6"/>
@@ -6656,10 +7044,10 @@
     </w:lvlOverride>
   </w:num>
   <w:num w:numId="13" w16cid:durableId="1388339102">
-    <w:abstractNumId w:val="13"/>
+    <w:abstractNumId w:val="14"/>
   </w:num>
   <w:num w:numId="14" w16cid:durableId="1766996021">
-    <w:abstractNumId w:val="11"/>
+    <w:abstractNumId w:val="12"/>
   </w:num>
   <w:num w:numId="15" w16cid:durableId="1135295762">
     <w:abstractNumId w:val="3"/>
@@ -6689,19 +7077,19 @@
     <w:abstractNumId w:val="4"/>
   </w:num>
   <w:num w:numId="20" w16cid:durableId="1727409014">
-    <w:abstractNumId w:val="12"/>
+    <w:abstractNumId w:val="13"/>
   </w:num>
   <w:num w:numId="21" w16cid:durableId="301732104">
     <w:abstractNumId w:val="5"/>
   </w:num>
   <w:num w:numId="22" w16cid:durableId="123041999">
-    <w:abstractNumId w:val="10"/>
+    <w:abstractNumId w:val="11"/>
   </w:num>
   <w:num w:numId="23" w16cid:durableId="718475216">
     <w:abstractNumId w:val="8"/>
   </w:num>
   <w:num w:numId="24" w16cid:durableId="1561749717">
-    <w:abstractNumId w:val="14"/>
+    <w:abstractNumId w:val="15"/>
   </w:num>
   <w:num w:numId="25" w16cid:durableId="664750277">
     <w:abstractNumId w:val="0"/>
@@ -6735,6 +7123,9 @@
     <w:lvlOverride w:ilvl="0">
       <w:startOverride w:val="5"/>
     </w:lvlOverride>
+  </w:num>
+  <w:num w:numId="31" w16cid:durableId="751896595">
+    <w:abstractNumId w:val="10"/>
   </w:num>
 </w:numbering>
 </file>

</xml_diff>